<commit_message>
trust: v1.157.0's two checker bugs join the bug card (8 found and fixed)
The trust page says it lists every real bug found in this checker, each
pinned by a trap that re-proves the fix. v1.157.0 fixed two and the page
still said six:

- synthetic-157: a Word header row marked the way Microsoft documents
  (Table Design → Header Row) was called unmarked — a correctly built
  agency agenda graded 69/D, now 100/A.
- synthetic-162: pasted "no shading" marks were read as shading, so a
  borderless layout grid could be scored as a data table.

Both traps are sabotage-verified against the old parser. Their manifest
chips become "bug" (the office battery's TrapChip type gains it), and the
brief template gains the two matching rows; build-brief and
trustPage.test both enforce rows == chips. No score or test count moved.
</commit_message>
<xml_diff>
--- a/docs/brief/checker-brief.docx
+++ b/docs/brief/checker-brief.docx
@@ -98,7 +98,7 @@
           <w:b/>
           <w:bCs/>
         </w:rPr>
-        <w:t xml:space="preserve">867</w:t>
+        <w:t xml:space="preserve">868</w:t>
       </w:r>
       <w:r>
         <w:t xml:space="preserve"> </w:t>
@@ -627,7 +627,7 @@
           <w:b/>
           <w:bCs/>
         </w:rPr>
-        <w:t xml:space="preserve">6 real bugs in the checker itself have been found and fixed</w:t>
+        <w:t xml:space="preserve">8 real bugs in the checker itself have been found and fixed</w:t>
       </w:r>
       <w:r>
         <w:t xml:space="preserve">: by the battery’s own first run (the blank-spaces description counted as real), by real agency files (the standard’s third</w:t>
@@ -654,7 +654,7 @@
           <w:b/>
           <w:bCs/>
         </w:rPr>
-        <w:t xml:space="preserve">The full inventory — 69 designed defects caught, 87 correct or hostile documents passed clean, 6 real bugs found in the checker and fixed</w:t>
+        <w:t xml:space="preserve">The full inventory — 69 designed defects caught, 85 correct or hostile documents passed clean, 8 real bugs found in the checker and fixed</w:t>
       </w:r>
       <w:r>
         <w:t xml:space="preserve"> </w:t>
@@ -1108,13 +1108,13 @@
       </w:r>
     </w:p>
     <w:bookmarkEnd w:id="17"/>
-    <w:bookmarkStart w:id="20" w:name="seven-months.-867-changes.-157-versions."/>
+    <w:bookmarkStart w:id="20" w:name="seven-months.-868-changes.-157-versions."/>
     <w:p>
       <w:pPr>
         <w:pStyle w:val="Heading2"/>
       </w:pPr>
       <w:r>
-        <w:t xml:space="preserve">Seven months. 867 changes. 157 versions.</w:t>
+        <w:t xml:space="preserve">Seven months. 868 changes. 157 versions.</w:t>
       </w:r>
     </w:p>
     <w:p>
@@ -1122,7 +1122,7 @@
         <w:pStyle w:val="FirstParagraph"/>
       </w:pPr>
       <w:r>
-        <w:t xml:space="preserve">Not a weekend project. Since March it has grown from a single PDF check into a checker for four kinds of files — 14 saved changes in the last 30 days alone, its battery of self-checks grown from about 1,500 in June to 3,796 today. All of it is public, on GitHub:</w:t>
+        <w:t xml:space="preserve">Not a weekend project. Since March it has grown from a single PDF check into a checker for four kinds of files — 15 saved changes in the last 30 days alone, its battery of self-checks grown from about 1,500 in June to 3,796 today. All of it is public, on GitHub:</w:t>
       </w:r>
       <w:r>
         <w:t xml:space="preserve"> </w:t>
@@ -6512,6 +6512,70 @@
           <w:i/>
           <w:iCs/>
         </w:rPr>
+        <w:t xml:space="preserve">(found a real bug)</w:t>
+      </w:r>
+    </w:p>
+    <w:p>
+      <w:pPr>
+        <w:pStyle w:val="Compact"/>
+        <w:numPr>
+          <w:ilvl w:val="0"/>
+          <w:numId w:val="1003"/>
+        </w:numPr>
+      </w:pPr>
+      <w:r>
+        <w:rPr>
+          <w:b/>
+          <w:bCs/>
+        </w:rPr>
+        <w:t xml:space="preserve">synthetic-158</w:t>
+      </w:r>
+      <w:r>
+        <w:t xml:space="preserve"> </w:t>
+      </w:r>
+      <w:r>
+        <w:t xml:space="preserve">— Word: the same table with Header Row unticked and no repeat header</w:t>
+      </w:r>
+      <w:r>
+        <w:t xml:space="preserve"> </w:t>
+      </w:r>
+      <w:r>
+        <w:rPr>
+          <w:i/>
+          <w:iCs/>
+        </w:rPr>
+        <w:t xml:space="preserve">(caught)</w:t>
+      </w:r>
+    </w:p>
+    <w:p>
+      <w:pPr>
+        <w:pStyle w:val="Compact"/>
+        <w:numPr>
+          <w:ilvl w:val="0"/>
+          <w:numId w:val="1003"/>
+        </w:numPr>
+      </w:pPr>
+      <w:r>
+        <w:rPr>
+          <w:b/>
+          <w:bCs/>
+        </w:rPr>
+        <w:t xml:space="preserve">synthetic-159</w:t>
+      </w:r>
+      <w:r>
+        <w:t xml:space="preserve"> </w:t>
+      </w:r>
+      <w:r>
+        <w:t xml:space="preserve">— Word: the same table marked with Repeat Header Rows instead</w:t>
+      </w:r>
+      <w:r>
+        <w:t xml:space="preserve"> </w:t>
+      </w:r>
+      <w:r>
+        <w:rPr>
+          <w:i/>
+          <w:iCs/>
+        </w:rPr>
         <w:t xml:space="preserve">(passed clean)</w:t>
       </w:r>
     </w:p>
@@ -6528,13 +6592,13 @@
           <w:b/>
           <w:bCs/>
         </w:rPr>
-        <w:t xml:space="preserve">synthetic-158</w:t>
-      </w:r>
-      <w:r>
-        <w:t xml:space="preserve"> </w:t>
-      </w:r>
-      <w:r>
-        <w:t xml:space="preserve">— Word: the same table with Header Row unticked and no repeat header</w:t>
+        <w:t xml:space="preserve">synthetic-160</w:t>
+      </w:r>
+      <w:r>
+        <w:t xml:space="preserve"> </w:t>
+      </w:r>
+      <w:r>
+        <w:t xml:space="preserve">— PowerPoint: a table with the Header Row box unticked</w:t>
       </w:r>
       <w:r>
         <w:t xml:space="preserve"> </w:t>
@@ -6560,13 +6624,13 @@
           <w:b/>
           <w:bCs/>
         </w:rPr>
-        <w:t xml:space="preserve">synthetic-159</w:t>
-      </w:r>
-      <w:r>
-        <w:t xml:space="preserve"> </w:t>
-      </w:r>
-      <w:r>
-        <w:t xml:space="preserve">— Word: the same table marked with Repeat Header Rows instead</w:t>
+        <w:t xml:space="preserve">synthetic-161</w:t>
+      </w:r>
+      <w:r>
+        <w:t xml:space="preserve"> </w:t>
+      </w:r>
+      <w:r>
+        <w:t xml:space="preserve">— PowerPoint: the same table with Header Row ticked</w:t>
       </w:r>
       <w:r>
         <w:t xml:space="preserve"> </w:t>
@@ -6592,70 +6656,6 @@
           <w:b/>
           <w:bCs/>
         </w:rPr>
-        <w:t xml:space="preserve">synthetic-160</w:t>
-      </w:r>
-      <w:r>
-        <w:t xml:space="preserve"> </w:t>
-      </w:r>
-      <w:r>
-        <w:t xml:space="preserve">— PowerPoint: a table with the Header Row box unticked</w:t>
-      </w:r>
-      <w:r>
-        <w:t xml:space="preserve"> </w:t>
-      </w:r>
-      <w:r>
-        <w:rPr>
-          <w:i/>
-          <w:iCs/>
-        </w:rPr>
-        <w:t xml:space="preserve">(caught)</w:t>
-      </w:r>
-    </w:p>
-    <w:p>
-      <w:pPr>
-        <w:pStyle w:val="Compact"/>
-        <w:numPr>
-          <w:ilvl w:val="0"/>
-          <w:numId w:val="1003"/>
-        </w:numPr>
-      </w:pPr>
-      <w:r>
-        <w:rPr>
-          <w:b/>
-          <w:bCs/>
-        </w:rPr>
-        <w:t xml:space="preserve">synthetic-161</w:t>
-      </w:r>
-      <w:r>
-        <w:t xml:space="preserve"> </w:t>
-      </w:r>
-      <w:r>
-        <w:t xml:space="preserve">— PowerPoint: the same table with Header Row ticked</w:t>
-      </w:r>
-      <w:r>
-        <w:t xml:space="preserve"> </w:t>
-      </w:r>
-      <w:r>
-        <w:rPr>
-          <w:i/>
-          <w:iCs/>
-        </w:rPr>
-        <w:t xml:space="preserve">(passed clean)</w:t>
-      </w:r>
-    </w:p>
-    <w:p>
-      <w:pPr>
-        <w:pStyle w:val="Compact"/>
-        <w:numPr>
-          <w:ilvl w:val="0"/>
-          <w:numId w:val="1003"/>
-        </w:numPr>
-      </w:pPr>
-      <w:r>
-        <w:rPr>
-          <w:b/>
-          <w:bCs/>
-        </w:rPr>
         <w:t xml:space="preserve">synthetic-162</w:t>
       </w:r>
       <w:r>
@@ -6672,7 +6672,7 @@
           <w:i/>
           <w:iCs/>
         </w:rPr>
-        <w:t xml:space="preserve">(passed clean)</w:t>
+        <w:t xml:space="preserve">(found a real bug)</w:t>
       </w:r>
     </w:p>
     <w:bookmarkEnd w:id="22"/>

</xml_diff>

<commit_message>
trust: the evolution span is computed; v1.157 joins the timeline
The trust page's evolution kicker was literal text and still read
"march to august 2026" in October, under a heading whose month count was
already computed ("Seven months"). It is now {{HISTORY_SPAN}}, built from
the first commit and today ("march to october 2026"), and a hard-coded
"<month> to <month> <year>" span joins build-brief's banned-pattern list —
verified to fail the build against the old template before it was fixed.

The timeline (newest first) gains v1.157: an agency agenda graded D for a
header row marked the way Microsoft documents, and the same unmarked table
costing a D, a C or a B depending on the file's format. The template's own
rule is to add an entry whenever a release changes how a grade is reached.
</commit_message>
<xml_diff>
--- a/docs/brief/checker-brief.docx
+++ b/docs/brief/checker-brief.docx
@@ -98,7 +98,7 @@
           <w:b/>
           <w:bCs/>
         </w:rPr>
-        <w:t xml:space="preserve">868</w:t>
+        <w:t xml:space="preserve">869</w:t>
       </w:r>
       <w:r>
         <w:t xml:space="preserve"> </w:t>
@@ -1108,13 +1108,13 @@
       </w:r>
     </w:p>
     <w:bookmarkEnd w:id="17"/>
-    <w:bookmarkStart w:id="20" w:name="seven-months.-868-changes.-157-versions."/>
+    <w:bookmarkStart w:id="20" w:name="seven-months.-869-changes.-157-versions."/>
     <w:p>
       <w:pPr>
         <w:pStyle w:val="Heading2"/>
       </w:pPr>
       <w:r>
-        <w:t xml:space="preserve">Seven months. 868 changes. 157 versions.</w:t>
+        <w:t xml:space="preserve">Seven months. 869 changes. 157 versions.</w:t>
       </w:r>
     </w:p>
     <w:p>
@@ -1122,7 +1122,7 @@
         <w:pStyle w:val="FirstParagraph"/>
       </w:pPr>
       <w:r>
-        <w:t xml:space="preserve">Not a weekend project. Since March it has grown from a single PDF check into a checker for four kinds of files — 15 saved changes in the last 30 days alone, its battery of self-checks grown from about 1,500 in June to 3,796 today. All of it is public, on GitHub:</w:t>
+        <w:t xml:space="preserve">Not a weekend project. Since March it has grown from a single PDF check into a checker for four kinds of files — 16 saved changes in the last 30 days alone, its battery of self-checks grown from about 1,500 in June to 3,796 today. All of it is public, on GitHub:</w:t>
       </w:r>
       <w:r>
         <w:t xml:space="preserve"> </w:t>

</xml_diff>

<commit_message>
release: v1.157.1 — dependency pass: 24 of the 26 advisories disclosed in v1.157.0 are closed
None was reachable in production (see v1.157.0); updated so the scan
reads clean instead of needing an explanation for each.

- devalue 5.9.1 → 5.9.4 (ships in the web server; six advisories)
- undici 8.10.0 → 8.11.2 (eleven; absent from the built server bundle)
- brace-expansion 2.1.4 → 2.1.7 and 5.0.9 → 5.0.12 (six; build tooling)
- multer 2.3.0 → 2.4.0 (diskStorage-only advisory; this API uses
  memoryStorage; 2.4.0 drops concat-stream and typedarray)

New version-scoped overrides devalue@5 and undici@8; brace-expansion@2/@5
floors raised. Remaining: braces <= 3.0.3 and node-forge <= 1.4.0, both
build/dev-only, no fixed version published. pnpm audit --prod: 2 (was 26).

fast-xml-parser unchanged (5.10.1). All gates re-run: ALL TRUTHS HELD
(162), NO SCORE MOVED (293), resave/encoding/legal/best-practice green;
tests 3,796; lint, typecheck, build clean. No application code changed.
</commit_message>
<xml_diff>
--- a/docs/brief/checker-brief.docx
+++ b/docs/brief/checker-brief.docx
@@ -50,13 +50,13 @@
           <w:b/>
           <w:bCs/>
         </w:rPr>
-        <w:t xml:space="preserve">12,558</w:t>
-      </w:r>
-      <w:r>
-        <w:t xml:space="preserve"> </w:t>
-      </w:r>
-      <w:r>
-        <w:t xml:space="preserve">check-ups run for internal and external agencies — the quick per-file check-up that has caught on beyond ICJIA: easier than SiteImprove, clearer than PAC. 45 in the last 30 days alone. ·</w:t>
+        <w:t xml:space="preserve">12,559</w:t>
+      </w:r>
+      <w:r>
+        <w:t xml:space="preserve"> </w:t>
+      </w:r>
+      <w:r>
+        <w:t xml:space="preserve">check-ups run for internal and external agencies — the quick per-file check-up that has caught on beyond ICJIA: easier than SiteImprove, clearer than PAC. 46 in the last 30 days alone. ·</w:t>
       </w:r>
       <w:r>
         <w:t xml:space="preserve"> </w:t>
@@ -98,7 +98,7 @@
           <w:b/>
           <w:bCs/>
         </w:rPr>
-        <w:t xml:space="preserve">869</w:t>
+        <w:t xml:space="preserve">870</w:t>
       </w:r>
       <w:r>
         <w:t xml:space="preserve"> </w:t>
@@ -987,7 +987,7 @@
           <w:b/>
           <w:bCs/>
         </w:rPr>
-        <w:t xml:space="preserve">6 documents came back for a re-check after repairs — and 2 of them climbed all the way to an A</w:t>
+        <w:t xml:space="preserve">7 documents came back for a re-check after repairs — and 3 of them climbed all the way to an A</w:t>
       </w:r>
       <w:r>
         <w:t xml:space="preserve">: failed, fixed, and passed under the same rules. This is the question behind every other question, and the answer no sales pitch can fake: the same file, failed and then passed.</w:t>
@@ -1108,13 +1108,13 @@
       </w:r>
     </w:p>
     <w:bookmarkEnd w:id="17"/>
-    <w:bookmarkStart w:id="20" w:name="seven-months.-869-changes.-157-versions."/>
+    <w:bookmarkStart w:id="20" w:name="seven-months.-870-changes.-157-versions."/>
     <w:p>
       <w:pPr>
         <w:pStyle w:val="Heading2"/>
       </w:pPr>
       <w:r>
-        <w:t xml:space="preserve">Seven months. 869 changes. 157 versions.</w:t>
+        <w:t xml:space="preserve">Seven months. 870 changes. 157 versions.</w:t>
       </w:r>
     </w:p>
     <w:p>
@@ -1122,7 +1122,7 @@
         <w:pStyle w:val="FirstParagraph"/>
       </w:pPr>
       <w:r>
-        <w:t xml:space="preserve">Not a weekend project. Since March it has grown from a single PDF check into a checker for four kinds of files — 16 saved changes in the last 30 days alone, its battery of self-checks grown from about 1,500 in June to 3,796 today. All of it is public, on GitHub:</w:t>
+        <w:t xml:space="preserve">Not a weekend project. Since March it has grown from a single PDF check into a checker for four kinds of files — 17 saved changes in the last 30 days alone, its battery of self-checks grown from about 1,500 in June to 3,796 today. All of it is public, on GitHub:</w:t>
       </w:r>
       <w:r>
         <w:t xml:space="preserve"> </w:t>
@@ -1197,7 +1197,7 @@
         <w:t xml:space="preserve"> </w:t>
       </w:r>
       <w:r>
-        <w:t xml:space="preserve">This is real software, battle-tested: 12,558 check-ups for internal and external agencies, 162 trap documents designed to fool it, an independent referee co-signing every report, and a public record of every change — and it is free. Nothing here asks for trust; every claim here is checkable by anyone:</w:t>
+        <w:t xml:space="preserve">This is real software, battle-tested: 12,559 check-ups for internal and external agencies, 162 trap documents designed to fool it, an independent referee co-signing every report, and a public record of every change — and it is free. Nothing here asks for trust; every claim here is checkable by anyone:</w:t>
       </w:r>
     </w:p>
     <w:p>

</xml_diff>